<commit_message>
Refresh Gateway v2 documentation and clean repository structure
</commit_message>
<xml_diff>
--- a/00_Jack_Kernel_Plain_English_Master_Guide_v0.1.1.docx
+++ b/00_Jack_Kernel_Plain_English_Master_Guide_v0.1.1.docx
@@ -90,11 +90,11 @@
       </w:pPr>
       <w:r>
         <w:rPr>
-          <w:b w:val="1"/>
+          <w:b/>
           <w:color w:val="5A6269"/>
           <w:sz w:val="22"/>
         </w:rPr>
-        <w:t>Public release guide | September 2026 | Live orchestration acceptance complete</w:t>
+        <w:t>Public release guide | 13 September 2026 | Live orchestration acceptance complete</w:t>
       </w:r>
     </w:p>
     <w:tbl>
@@ -265,13 +265,16 @@
         <w:jc w:val="center"/>
       </w:pPr>
       <w:r>
-        <w:t>This is the long-form user and developer guide for the public v0.1.1 release. It keeps the full architectural explanation, but also adds practical setup, mode selection, Pi integration, release-test evidence, and troubleshooting so readers can use Jack without first studying the research papers or source code. This revision incorporates the live-accepted Orchestration Gateway v2: a Jack-mediated supervisory control plane with run-bound identity, ordered replay, explicit cancellation and physical-settlement semantics, proven concurrent supervisor/worker inference through Jack, and deterministic Primary-Pi-unavailable failure behavior. Jack Kernel itself remains v0.1.1; Gateway v2 is a subsystem/protocol revision, not a rename of the kernel.</w:t>
+        <w:t>This is the long-form user and developer guide for the public v0.1.1 release. It keeps the full architectural explanation, but also adds practical setup, mode selection, Pi integration, release-test evidence, and troubleshooting so readers can use Jack without first studying the research papers or source code. This revision incorporates the live-accepted Orchestration Gateway v2: a Jack-mediated supervisory control plane with run-bound identity, ordered replay, explicit cancellation and physical-settlement semantics, proven concurrent supervisor/worker inference through Jack, and deterministic Primary-Pi-unavailable failure behavior. Jack Kernel itself remains v0.1.1; Gateway v2 is a subsystem/protocol revision, not a rename of the kernel. The current GitHub release is tagged v0.1.1-orchestration-gateway-v2 at accepted integration commit 1d583827715ddd276019a40fbf268ae9d01fbe0b.</w:t>
       </w:r>
     </w:p>
     <w:p>
       <w:pPr>
         <w:spacing w:after="0" w:beforeAutospacing="0" w:afterAutospacing="0"/>
       </w:pPr>
+      <w:r>
+        <w:t>Current public release: v0.1.1-orchestration-gateway-v2 | accepted integration commit: 1d583827715ddd276019a40fbf268ae9d01fbe0b | accepted release package SHA-256: 6A3A9CC83BEF71D951939FC00AD06313EA80CECB5F245F1E3B27EED20954D8A5</w:t>
+      </w:r>
     </w:p>
     <w:p>
       <w:pPr>
@@ -13728,7 +13731,7 @@
           <w:color w:val="28323C"/>
           <w:sz w:val="20"/>
         </w:rPr>
-        <w:t>Jack Kernel Preview — Programmable Cognition Runtime, public-name revision: Deep Research.</w:t>
+        <w:t>Jack Kernel Preview — Programmable Cognition Runtime v0.1.1, updated for the live-accepted Orchestration Gateway v2 integration.</w:t>
       </w:r>
     </w:p>
     <w:p>
@@ -13742,7 +13745,7 @@
           <w:color w:val="28323C"/>
           <w:sz w:val="20"/>
         </w:rPr>
-        <w:t>Jack Kernel Runtime Specification, public-name revision: Deep Research.</w:t>
+        <w:t>Jack Kernel v0.1.1 Runtime Specification, updated to include the accepted Gateway v2 runtime/control surface while preserving existing inference-mode contracts.</w:t>
       </w:r>
     </w:p>
     <w:p>
@@ -13756,7 +13759,7 @@
           <w:color w:val="28323C"/>
           <w:sz w:val="20"/>
         </w:rPr>
-        <w:t>Jack Kernel Long-Horizon Cognition Technical Whitepaper, public-name revision: Deep Research.</w:t>
+        <w:t>Jack Kernel v0.1.1 Long-Horizon Cognition Technical Whitepaper, updated to incorporate accepted Gateway v2 identity, lifecycle, replay, settlement, concurrency, and boundary semantics.</w:t>
       </w:r>
     </w:p>
     <w:p>

</xml_diff>

<commit_message>
Refresh validated release documentation
</commit_message>
<xml_diff>
--- a/00_Jack_Kernel_Plain_English_Master_Guide_v0.1.1.docx
+++ b/00_Jack_Kernel_Plain_English_Master_Guide_v0.1.1.docx
@@ -37,7 +37,7 @@
         <w:jc w:val="center"/>
       </w:pPr>
       <w:r>
-        <w:t>Plain-English Master Guide - v0.1.1 Release Edition | Orchestration Gateway v2 Accepted</w:t>
+        <w:t>Plain-English Master Guide - v0.1.1 Release Edition | Surgical Resilience + Orchestration Gateway v2</w:t>
       </w:r>
     </w:p>
     <w:tbl>
@@ -89,12 +89,7 @@
         <w:jc w:val="center"/>
       </w:pPr>
       <w:r>
-        <w:rPr>
-          <w:b/>
-          <w:color w:val="5A6269"/>
-          <w:sz w:val="22"/>
-        </w:rPr>
-        <w:t>Public release guide | 13 September 2026 | Live orchestration acceptance complete</w:t>
+        <w:t>Public release guide | 17 September 2026 | Current validated runtime resilience and consolidated orchestration documentation</w:t>
       </w:r>
     </w:p>
     <w:tbl>
@@ -265,7 +260,7 @@
         <w:jc w:val="center"/>
       </w:pPr>
       <w:r>
-        <w:t>This is the long-form user and developer guide for the public v0.1.1 release. It keeps the full architectural explanation, but also adds practical setup, mode selection, Pi integration, release-test evidence, and troubleshooting so readers can use Jack without first studying the research papers or source code. This revision incorporates the live-accepted Orchestration Gateway v2: a Jack-mediated supervisory control plane with run-bound identity, ordered replay, explicit cancellation and physical-settlement semantics, proven concurrent supervisor/worker inference through Jack, and deterministic Primary-Pi-unavailable failure behavior. Jack Kernel itself remains v0.1.1; Gateway v2 is a subsystem/protocol revision, not a rename of the kernel. The current GitHub release is tagged v0.1.1-orchestration-gateway-v2 at accepted integration commit 1d583827715ddd276019a40fbf268ae9d01fbe0b.</w:t>
+        <w:t>This is the long-form user and developer guide for Jack Kernel v0.1.1. It keeps the full architectural explanation while adding practical setup, mode selection, Pi integration, validation evidence, and troubleshooting. This revision incorporates the validated surgical-resilience pass: structural evidence-origin ownership without rewriting useful tool payloads; explicit caller-supplied tool-result provenance on immediate resume; compatibility-adjusted backend payloads that remain adjusted across later retries; additive fail-soft runtime-component identity; corrected Pi retry-epoch and prior-error semantics; recoverable structured tool failures retained as diagnostics without poisoning a successful task; and the consolidated Orchestration Gateway v2 documentation authority. The cognition-program contracts themselves are unchanged by these resilience fixes.</w:t>
       </w:r>
     </w:p>
     <w:p>
@@ -273,7 +268,7 @@
         <w:spacing w:after="0" w:beforeAutospacing="0" w:afterAutospacing="0"/>
       </w:pPr>
       <w:r>
-        <w:t>Current public release: v0.1.1-orchestration-gateway-v2 | accepted integration commit: 1d583827715ddd276019a40fbf268ae9d01fbe0b | accepted release package SHA-256: 6A3A9CC83BEF71D951939FC00AD06313EA80CECB5F245F1E3B27EED20954D8A5</w:t>
+        <w:t>Current validated resilience tag: v0.1.1-surgical-resilience | validated runtime baseline commit: 4c8b33cc34e1545f5d564ddbcd2429239bb71297 | current documentation authority: repository main | historical Gateway v2 integration commit: 1d583827715ddd276019a40fbf268ae9d01fbe0b | repository: github.com/mlangford75-lgtm/Jack-Kernel</w:t>
       </w:r>
     </w:p>
     <w:p>
@@ -596,7 +591,7 @@
         <w:jc w:val="center"/>
       </w:pPr>
       <w:r>
-        <w:t>Restart Primary Pi after installing the accepted bridge. Jack Orchestrator, if used, runs as a separate cognition-only supervisory Pi with its own mutable state. Its worker-control requests go to Jack at /jack/orchestration; it does not receive the private Pi bridge credential or direct backend access.</w:t>
+        <w:t>Restart Primary Pi after installing the current validated bridge. Any compatible supervisor controls Primary Pi through Jack at /jack/orchestration and never receives the private Pi bridge credential. A local-model supervisor routes its own cognition through Jack /v1; a cloud-model supervisor keeps native cloud cognition and uses Jack only for worker control. Neither a locally modeled supervisor nor Primary Pi should connect directly to the configured local model backend.</w:t>
       </w:r>
     </w:p>
     <w:p>
@@ -768,7 +763,7 @@
         <w:spacing w:lineRule="auto" w:line="250" w:after="50" w:beforeAutospacing="0" w:afterAutospacing="0"/>
       </w:pPr>
       <w:r>
-        <w:t>Jack can also govern a supervisor-to-worker boundary. A cognition-only supervisor can reason through Jack and supervise a privileged Primary Pi worker through Jack without receiving the worker bridge credential, direct backend topology, filesystem tools, or shell tools.</w:t>
+        <w:t>Jack can also govern a supervisor-to-worker boundary. The supervisor's model source may vary, but every worker-control action crosses Jack. A local-model supervisor reasons through Jack /v1 and supervises Primary Pi through /jack/orchestration; a cloud-model supervisor keeps native cloud cognition and still supervises Primary Pi through /jack/orchestration. No supervisor receives the worker bridge credential, and no locally modeled supervisor or worker bypasses Jack to reach the local backend.</w:t>
       </w:r>
     </w:p>
     <w:p>
@@ -2883,7 +2878,7 @@
         <w:pStyle w:val="P0"/>
       </w:pPr>
       <w:r>
-        <w:t>Jack now has a live-accepted supervisor-to-worker control path. This does not make Jack the supervisor, the worker, or a generic multi-agent application framework. It means the same host-authoritative mediation layer can govern how supervisory cognition reaches a privileged worker, while keeping the worker’s private bridge credential and backend topology behind Jack.</w:t>
+        <w:t>Jack now has a live-accepted supervisor-to-worker control path. This does not make Jack the supervisor, the worker, or a generic multi-agent application framework. It means the same host-authoritative mediation layer can govern how supervisory decisions reach a privileged worker while keeping the worker's private bridge credential behind Jack. For a local-model supervisor, Jack also remains the only supported path to the local model. For a cloud-model supervisor, cognition stays with the native cloud provider while worker control still crosses Jack.</w:t>
       </w:r>
     </w:p>
     <w:p>
@@ -2891,7 +2886,7 @@
         <w:pStyle w:val="P0"/>
       </w:pPr>
       <w:r>
-        <w:t>Jack Orchestrator -&gt; Jack public orchestration API -&gt; private Pi control bridge -&gt; privileged Primary Pi worker</w:t>
+        <w:t>Any orchestration agent -&gt; Jack public orchestration API -&gt; private Pi control bridge -&gt; privileged Primary Pi worker</w:t>
       </w:r>
     </w:p>
     <w:p>
@@ -2899,7 +2894,11 @@
         <w:pStyle w:val="P0"/>
       </w:pPr>
       <w:r>
-        <w:t>Jack Orchestrator cognition -&gt; Jack /v1 inference surface -&gt; Jack-selected backend/model</w:t>
+        <w:t>Local-model orchestrator cognition -&gt; Jack /v1 inference surface -&gt; Jack-selected backend/model</w:t>
+        <w:br/>
+        <w:t>Cloud-model orchestrator cognition &lt;-&gt; native cloud provider</w:t>
+        <w:br/>
+        <w:t>Primary Pi cognition -&gt; Jack /v1 inference surface -&gt; Jack-selected backend/model</w:t>
       </w:r>
     </w:p>
     <w:p>
@@ -2907,7 +2906,7 @@
         <w:pStyle w:val="P0"/>
       </w:pPr>
       <w:r>
-        <w:t>The two paths are intentionally distinct. The inference plane gives the supervisor cognition while preserving Jack’s backend/model abstraction. The orchestration plane gives it narrowly defined supervisory consequence: worker status, event observation, task submission, cancellation, and worker-session reset. The accepted Jack Orchestrator exposes exactly five model-facing tools—worker_status, watch_worker, submit_worker_task, cancel_worker_task, and new_worker_session—and no direct filesystem, shell, or process tools.</w:t>
+        <w:t>The cognition path and worker-control path are intentionally distinct. A local-model supervisor uses Jack /v1 for cognition, preserving Jack's backend/model abstraction; a cloud-model supervisor does not route its own cognition through Jack merely because the worker does. Every supervisor uses /jack/orchestration for narrowly defined supervisory consequence: worker status, live event observation, task submission, cancellation, and worker-session reset. The accepted Jack Orchestrator exposes exactly five model-facing tools—worker_status, watch_worker, submit_worker_task, cancel_worker_task, and new_worker_session—and no direct filesystem, shell, or process tools. Those exact tools are properties of the reference client; compatibility is defined by capabilities and authority boundaries, not by those names.</w:t>
       </w:r>
     </w:p>
     <w:p>
@@ -2915,7 +2914,7 @@
         <w:pStyle w:val="P0"/>
       </w:pPr>
       <w:r>
-        <w:t>Direct authority and supervisory authority are different. Jack Orchestrator cannot execute privileged host consequences itself. Its consequential influence over Primary Pi crosses the Jack-mediated supervisory boundary. Primary Pi remains the privileged worker that actually uses filesystem, shell, build, and test tools. Gateway v2 governs this supervisor-to-worker control path; it does not claim to intercept every privileged filesystem, shell, or process action performed inside Primary Pi.</w:t>
+        <w:t>Direct authority and supervisory authority are different. The accepted Jack Orchestrator cannot execute privileged host consequences itself. Its consequential influence over Primary Pi crosses the Jack-mediated supervisory boundary. Primary Pi remains the privileged worker that actually uses filesystem, shell, build, and test tools. Gateway v2 governs this supervisor-to-worker control path; it does not claim to intercept every privileged filesystem, shell, or process action performed inside Primary Pi. Another compatible orchestrator may be implemented differently internally, but it still may not bypass Jack for worker control, and a locally modeled orchestrator may not bypass Jack for model inference.</w:t>
       </w:r>
     </w:p>
     <w:p>
@@ -2923,7 +2922,7 @@
         <w:pStyle w:val="P0"/>
       </w:pPr>
       <w:r>
-        <w:t>The transport also keeps observation separate from authority. Task lifecycle state is authoritative; message_end is not task completion. Gateway v2 attributes message/tool events only when the Pi bridge has positive run-bound evidence. Otherwise task_id, run_id, and run_epoch remain null instead of being guessed from whichever task happens to be current. Jack adds monotonic process-local sequencing, bounded replay/reconnect, explicit terminal-versus-physical-settlement semantics, and deterministic downstream-unavailable failure behavior.</w:t>
+        <w:t>The transport also keeps observation separate from authority. Task lifecycle state is authoritative; message_end is not task completion and agent_end is not full physical settlement. Gateway v2 attributes message/tool events only when the Pi bridge has positive run-bound evidence. Otherwise task_id, run_id, and run_epoch remain null instead of being guessed from whichever task happens to be current. Jack adds monotonic process-local sequencing, bounded replay/reconnect, explicit terminal-versus-physical-settlement semantics, and deterministic downstream-unavailable failure behavior. During active supervision the orchestrator must consume /jack/orchestration/events live; status polling is for readiness and terminal reconciliation, not a substitute for the event stream.</w:t>
       </w:r>
     </w:p>
     <w:p>
@@ -2941,7 +2940,106 @@
         <w:jc w:val="center"/>
       </w:pPr>
       <w:r>
-        <w:t>The architectural rule is simple: Jack Orchestrator sees Jack and nothing behind Jack. Its cognition endpoint is http://127.0.0.1:8001/v1 and its supervisory endpoint family is http://127.0.0.1:8001/jack/orchestration. Jack knows the selected backend/model and privately holds the downstream Pi control credential. Jack Orchestrator does not query LM Studio, Ollama, llama.cpp, PAIR nodes, port 8013, Primary Pi configuration, or the Pi controlToken.</w:t>
+        <w:t>For the accepted local Jack Orchestrator, the architectural rule is simple: Jack Orchestrator sees Jack and nothing behind Jack. Its cognition endpoint is http://127.0.0.1:8001/v1 and its supervisory endpoint family is http://127.0.0.1:8001/jack/orchestration. Jack knows the selected backend/model and privately holds the downstream Pi control credential. Jack Orchestrator does not query LM Studio, Ollama, llama.cpp, PAIR nodes, port 8013, Primary Pi configuration, or the Pi controlToken. Generalized rule: every supervisor controls the worker through Jack; every locally modeled supervisor and worker reaches the local model through Jack; cloud supervisors keep native cloud cognition.</w:t>
+      </w:r>
+    </w:p>
+    <w:p>
+      <w:pPr>
+        <w:pStyle w:val="P4"/>
+        <w:keepNext w:val="1"/>
+      </w:pPr>
+      <w:r>
+        <w:t>How to build a local-model orchestrator</w:t>
+      </w:r>
+    </w:p>
+    <w:p>
+      <w:pPr>
+        <w:spacing w:lineRule="auto" w:line="240" w:before="120" w:after="60" w:beforeAutospacing="0" w:afterAutospacing="0"/>
+        <w:jc w:val="center"/>
+      </w:pPr>
+      <w:r>
+        <w:t>Treat the orchestrator as a supervisory runtime around a local reasoning model, not as a second worker and not as a thin proxy. Give it two logically separate Jack clients: a cognition client that sends all supervisor model inference to Jack /v1, and a worker-control client that uses only the public /jack/orchestration endpoints. Do not configure a fallback connection to LM Studio, Ollama, llama.cpp, port 8013, or the Pi controlToken. Jack owns backend resolution and the private worker-control hop.</w:t>
+      </w:r>
+    </w:p>
+    <w:p>
+      <w:pPr>
+        <w:spacing w:lineRule="auto" w:line="240" w:before="120" w:after="60" w:beforeAutospacing="0" w:afterAutospacing="0"/>
+        <w:jc w:val="center"/>
+      </w:pPr>
+      <w:r>
+        <w:t>Keep probabilistic judgment and deterministic control state separate. The local model decides what the user wants, what bounded worker instruction should happen next, whether a worker result is adequate, whether more work is needed, whether cancellation/session replacement is appropriate, and what to tell the user. Host code owns session readiness, task admission, task_id, run_id, run_epoch, seq, attribution, tool lifecycle, cancellation state, physical settlement, session replacement, and worker availability. A useful pattern is for the model to produce a structured supervisory intent and for a deterministic action validator to admit or reject that intent against current Jack state.</w:t>
+      </w:r>
+    </w:p>
+    <w:p>
+      <w:pPr>
+        <w:spacing w:lineRule="auto" w:line="240" w:before="120" w:after="60" w:beforeAutospacing="0" w:afterAutospacing="0"/>
+        <w:jc w:val="center"/>
+      </w:pPr>
+      <w:r>
+        <w:t>Maintain an authoritative orchestration ledger. At minimum track the user objective/plan, sessionInstanceId, current or last task_id, run_id, run_epoch, last processed seq, runOpen/settledAt, active tool calls and their terminal state, current worker/task state, and any pending supervisory decision. Build a model-safe supervisory projection from that ledger instead of dumping raw transport noise into context. The projection may say, for example, that read index.html started and has no observed tool_end while runOpen remains true; it may not upgrade that fact into a claim that the tool is hung.</w:t>
+      </w:r>
+    </w:p>
+    <w:p>
+      <w:pPr>
+        <w:pStyle w:val="P4"/>
+        <w:keepNext w:val="1"/>
+      </w:pPr>
+      <w:r>
+        <w:t>The correct live-supervision cycle</w:t>
+      </w:r>
+    </w:p>
+    <w:p>
+      <w:pPr>
+        <w:spacing w:lineRule="auto" w:line="240" w:before="120" w:after="60" w:beforeAutospacing="0" w:afterAutospacing="0"/>
+        <w:jc w:val="center"/>
+      </w:pPr>
+      <w:r>
+        <w:t>Before each task, GET /jack/orchestration/status and require sessionReady=true, sessionTransitioning=false, and no prior controlled run physically open. Whenever practical, open or maintain GET /jack/orchestration/events before submitting the task. Record the current/latest seq, POST exactly one task with {"prompt":"&lt;non-empty task text&gt;"}, retain the returned task_id, bind run_id/run_epoch only when Jack exposes them, and consume worker messages plus tool_start/tool_update/tool_end events live. Observe agent_end but continue supervising until Jack reports terminal state with runOpen=false and settlement metadata. Only then is overlapping follow-up work admissible.</w:t>
+      </w:r>
+    </w:p>
+    <w:p>
+      <w:pPr>
+        <w:pStyle w:val="P4"/>
+        <w:keepNext w:val="1"/>
+      </w:pPr>
+      <w:r>
+        <w:t>Silence is not settlement</w:t>
+      </w:r>
+    </w:p>
+    <w:p>
+      <w:pPr>
+        <w:spacing w:lineRule="auto" w:line="240" w:before="120" w:after="60" w:beforeAutospacing="0" w:afterAutospacing="0"/>
+        <w:jc w:val="center"/>
+      </w:pPr>
+      <w:r>
+        <w:t>A quiet SSE stream does not mean the worker stopped. A local SSE-reader timeout does not mean the worker timed out. If the stream disconnects, replay from the last processed seq with Last-Event-ID or ?after=&lt;seq&gt;, then reconcile the replayed events with current status. If Jack returns 409 orchestration_replay_gap, report that the missing interval is unavailable instead of reconstructing it. If runOpen=true and the last run-bound event is an unterminated tool operation, report exactly that state and do not call the task complete, failed, stopped, or hung without additional authoritative evidence.</w:t>
+      </w:r>
+    </w:p>
+    <w:p>
+      <w:pPr>
+        <w:pStyle w:val="P4"/>
+        <w:keepNext w:val="1"/>
+      </w:pPr>
+      <w:r>
+        <w:t>Cancellation, session replacement, and recovery</w:t>
+      </w:r>
+    </w:p>
+    <w:p>
+      <w:pPr>
+        <w:spacing w:lineRule="auto" w:line="240" w:before="120" w:after="60" w:beforeAutospacing="0" w:afterAutospacing="0"/>
+        <w:jc w:val="center"/>
+      </w:pPr>
+      <w:r>
+        <w:t>Cancellation and physical settlement are separate. A task may be logically cancelled while runOpen remains true, so do not admit another controlled task until the prior run closes. A new worker session is requested only through /jack/orchestration/session/new: record the old sessionInstanceId, stop task admission, tolerate temporary Jack 502 while the bridge is replaced, wait for sessionReady=true and sessionTransitioning=false, and require new sessionInstanceId != old sessionInstanceId before follow-up. Do not blindly retry an ambiguous submission because it may duplicate work. If Jack cannot reach the bridge, stop and report the failure; there is no direct fallback.</w:t>
+      </w:r>
+    </w:p>
+    <w:p>
+      <w:pPr>
+        <w:spacing w:lineRule="auto" w:line="240" w:before="120" w:after="60" w:beforeAutospacing="0" w:afterAutospacing="0"/>
+        <w:jc w:val="center"/>
+      </w:pPr>
+      <w:r>
+        <w:t>For an orchestrator that can survive its own restart, persist enough ledger state to reconcile with Jack after restart instead of assuming Primary Pi also restarted. The minimum useful persistent set is the user objective/plan, sessionInstanceId, current/last task_id and run identity, last processed seq, active tool states, known terminal/settlement state, and pending decision. Documentation/Orchestration/ORCHESTRATION_GATEWAY_V2_TECHNICAL_SPEC.md is the formal protocol and compatibility boundary; Documentation/Orchestration/ORCHESTRATOR_INSTRUCTIONS.md is the operational procedure.</w:t>
       </w:r>
     </w:p>
     <w:p>
@@ -2992,7 +3090,7 @@
         <w:rPr>
           <w:i/>
         </w:rPr>
-        <w:t>Figure — Accepted Jack Orchestrator topology. The supervisor has cognition through Jack and supervisory influence through Jack; privileged execution remains in Primary Pi.</w:t>
+        <w:t>Figure — Accepted local Jack Orchestrator topology. This figure shows the reference local-model deployment: supervisor cognition and supervisory influence both cross Jack, while privileged execution remains in Primary Pi. Cloud-model supervisors retain native cloud cognition but use the same Jack-mediated worker-control path.</w:t>
       </w:r>
     </w:p>
     <w:p>
@@ -3028,7 +3126,7 @@
         <w:jc w:val="center"/>
       </w:pPr>
       <w:r>
-        <w:t>Every public orchestration event receives a monotonic process-local sequence number and preserves both Jack receipt time and the original Pi source event. The default replay buffer retains 512 events. A reconnect can resume with Last-Event-ID or ?after=&lt;seq&gt;. Live acceptance disconnected after sequence 42, allowed another controlled task to finish, then recovered sequences 43 through 90 in strict order with no duplicates while preserving source and source_event. When a client requested history older than the retained window, Jack returned HTTP 409 with orchestration_replay_gap; the observed retained range was exactly 512 events, 123 through 634 inclusive.</w:t>
+        <w:t>Every public orchestration event receives a monotonic process-local sequence number and preserves both Jack receipt time and the original Pi source event. The default replay buffer retains 512 events. A reconnect can resume with Last-Event-ID or ?after=&lt;seq&gt;. Live acceptance disconnected after sequence 42, allowed another controlled task to finish, then recovered sequences 43 through 90 in strict order with no duplicates while preserving source and source_event. When a client requested history older than the retained window, Jack returned HTTP 409 with orchestration_replay_gap; the observed retained range was exactly 512 events, 123 through 634 inclusive. The orchestrator must retain its last processed seq. If its SSE reader times out or disconnects, that local event does not prove anything about worker state; reconnect with replay and reconcile current status before making a definitive claim.</w:t>
       </w:r>
     </w:p>
     <w:p>
@@ -3064,7 +3162,7 @@
         <w:jc w:val="center"/>
       </w:pPr>
       <w:r>
-        <w:t>Gateway transport is deliberately outside Jack’s inference semaphore so orchestration observation/control cannot deadlock the worker’s own inference path. Jack’s inference semaphore still controls actual backend concurrency. With the launcher’s saved Maximum concurrent Kernel requests setting changed to 2, live LM Studio logs proved both direct Jack concurrency and full-topology concurrency: Primary Pi worker inference and Jack Orchestrator inference occupied separate backend slots and generated tokens simultaneously. The saved launcher configuration is authoritative; setting only a parent-shell JACK_MAX_CONCURRENT environment variable is not sufficient because the launcher writes its configured value into the server child environment.</w:t>
+        <w:t>Gateway transport is deliberately outside Jack’s inference semaphore so orchestration observation/control cannot deadlock the worker’s own inference path. Jack’s inference semaphore still controls actual backend concurrency. With the launcher’s saved Maximum concurrent Kernel requests setting changed to 2, live LM Studio logs proved both direct Jack concurrency and full-topology concurrency: Primary Pi worker inference and local Jack Orchestrator inference occupied separate backend slots and generated tokens simultaneously. This two-slot requirement applies when both supervisor and worker are local-model participants through Jack. A cloud-model supervisor’s own cognition remains on its native provider and does not consume a Jack local-inference slot. The saved launcher configuration is authoritative; setting only a parent-shell JACK_MAX_CONCURRENT environment variable is not sufficient because the launcher writes its configured value into the server child environment.</w:t>
       </w:r>
     </w:p>
     <w:p>
@@ -3155,7 +3253,7 @@
         <w:pStyle w:val="P22"/>
       </w:pPr>
       <w:r>
-        <w:t>Accepted Primary-Pi bridge identity: SHA-256 D066FA2F9B8A3735A60F57F028087F314F484B28DBD10640FB3D64A4FA29C664.</w:t>
+        <w:t>Current validated Primary-Pi bridge identity: SHA-256 E758883F3C18CBEFBF5590C720DBEDF7AB8E85D3314B5EA77E277B1A8C3BD3E4. The September 12 acceptance record preserves the earlier D066... bridge identity as historical evidence rather than rewriting that test history.</w:t>
       </w:r>
     </w:p>
     <w:p>
@@ -3173,7 +3271,7 @@
         <w:jc w:val="center"/>
       </w:pPr>
       <w:r>
-        <w:t>Gateway v2 does not make Jack Orchestrator a privileged execution agent, does not make model cognition deterministic, does not turn the bounded replay buffer into a durable forensic archive, and does not claim universal interception of every action available inside Primary Pi. The precise claim is narrower and stronger: Jack mediates the supervisor-to-worker control boundary and the host-governed inference environment around both supervisor and worker cognition.</w:t>
+        <w:t>Gateway v2 does not make an orchestration agent a privileged execution agent, does not make model cognition deterministic, does not turn the bounded replay buffer into a durable forensic archive, and does not claim universal interception of every action available inside Primary Pi. The precise claim is narrower and stronger: Jack mediates the supervisor-to-worker control boundary; for locally modeled participants it also mediates local-model inference; deterministic transport state remains separate from the supervisor model’s interpretation of that state.</w:t>
       </w:r>
     </w:p>
     <w:p>
@@ -6602,6 +6700,22 @@
         <w:t>A model-authored statement that a file was written, a command ran, a browser opened, or a test passed is not host execution evidence. An actual host-returned tool result establishes that the tool ran and returned something. Even then, the result proves only what it actually tested.</w:t>
       </w:r>
     </w:p>
+    <w:p>
+      <w:pPr>
+        <w:spacing w:lineRule="auto" w:line="259" w:before="0" w:after="100" w:beforeAutospacing="0" w:afterAutospacing="0"/>
+      </w:pPr>
+      <w:r>
+        <w:t>Jack separates host-authoritative provenance from model-readable payload. Reserved evidence-receipt syntax remains Jack-owned; backend-visible projection preserves useful evidence facts without allowing payload text to become host metadata. Provenance-looking strings inside tool content are ordinary task data unless the host supplied the corresponding structural metadata. This is the practical form of Jack's current rule: strict authority, permissive information.</w:t>
+      </w:r>
+    </w:p>
+    <w:p>
+      <w:pPr>
+        <w:spacing w:lineRule="auto" w:line="259" w:before="0" w:after="100" w:beforeAutospacing="0" w:afterAutospacing="0"/>
+      </w:pPr>
+      <w:r>
+        <w:t>Immediate caller-supplied role=tool resume now carries explicit host provenance as caller_supplied_tool_result while preserving the exact tool payload. Generic tool results do not claim Pi-session recovery authority, and free-form error-looking strings are not promoted into structured failure truth. Model-emitted reserved evidence markers remain blocked. The result is stronger authority separation without discarding useful content.</w:t>
+      </w:r>
+    </w:p>
     <w:tbl>
       <w:tblPr>
         <w:tblW w:w="0" w:type="auto"/>
@@ -9472,7 +9586,7 @@
         <w:spacing w:lineRule="auto" w:line="259" w:before="0" w:after="100" w:beforeAutospacing="0" w:afterAutospacing="0"/>
       </w:pPr>
       <w:r>
-        <w:t>Jack presents an OpenAI-compatible /v1/chat/completions surface to agents while routing to a configured local or OpenAI-compatible backend. The public v0.1.1 release listens by default at http://127.0.0.1:8001/v1. Orchestration Gateway v2 adds the public supervisory surface under http://127.0.0.1:8001/jack/orchestration. Jack alone privately reaches the Primary-Pi bridge on 127.0.0.1:8013 using its separate control credential. LM Studio remains the default backend at http://127.0.0.1:1234/v1; built-in presets also cover Ollama, Jan.ai, raw llama.cpp llama-server, and compatible endpoints.</w:t>
+        <w:t>Jack presents an OpenAI-compatible /v1/chat/completions surface to agents while routing to a configured local or OpenAI-compatible backend. The public v0.1.1 release listens by default at http://127.0.0.1:8001/v1. Orchestration Gateway v2 adds the public supervisory surface under http://127.0.0.1:8001/jack/orchestration. Every supervisor uses that orchestration surface for worker control. A local-model supervisor also uses Jack /v1 for its own cognition; a cloud-model supervisor keeps native cloud cognition. Primary Pi uses Jack /v1 for its model inference. Jack alone privately reaches the Primary-Pi bridge on 127.0.0.1:8013 using its separate control credential. LM Studio remains the default backend at http://127.0.0.1:1234/v1; built-in presets also cover Ollama, Jan.ai, raw llama.cpp llama-server, and compatible endpoints.</w:t>
       </w:r>
     </w:p>
     <w:p>
@@ -9575,7 +9689,7 @@
         <w:pStyle w:val="P22"/>
       </w:pPr>
       <w:r>
-        <w:t>Supervisor observation -&gt; Jack: GET /jack/orchestration/status and GET /jack/orchestration/events.</w:t>
+        <w:t>Supervisor live observation -&gt; Jack: GET /jack/orchestration/events. Keep the SSE stream active during controlled work, retain the last processed seq, and use replay after reconnect. GET /jack/orchestration/status is used for readiness and terminal reconciliation, not as a replacement for live observation.</w:t>
       </w:r>
     </w:p>
     <w:p>
@@ -9583,7 +9697,7 @@
         <w:pStyle w:val="P22"/>
       </w:pPr>
       <w:r>
-        <w:t>Supervisor controlled work -&gt; Jack: POST /jack/orchestration/tasks, POST /jack/orchestration/tasks/cancel, and POST /jack/orchestration/session/new.</w:t>
+        <w:t>Supervisor controlled work -&gt; Jack: POST /jack/orchestration/tasks, POST /jack/orchestration/tasks/cancel, and POST /jack/orchestration/session/new. Submit one controlled task at a time and do not overlap work while a prior run remains physically open.</w:t>
       </w:r>
     </w:p>
     <w:p>
@@ -9591,7 +9705,7 @@
         <w:pStyle w:val="P22"/>
       </w:pPr>
       <w:r>
-        <w:t>Jack -&gt; Primary Pi private bridge: http://127.0.0.1:8013. This route and its credential are private to Jack; Jack Orchestrator does not use them directly.</w:t>
+        <w:t>Jack -&gt; Primary Pi private bridge: http://127.0.0.1:8013. This route and its credential are private to Jack; no orchestration agent uses them directly. Local-model supervisors and Primary Pi also do not connect directly to the configured model backend.</w:t>
       </w:r>
     </w:p>
     <w:p>
@@ -9678,11 +9792,7 @@
     </w:p>
     <w:p>
       <w:r>
-        <w:rPr>
-          <w:b w:val="0"/>
-          <w:i w:val="0"/>
-        </w:rPr>
-        <w:t>The release includes Pi/jack-kernel.ts and Pi/install-jack-kernel-extension.ps1 for provider/context synchronization, plus Pi/pi-control-bridge.ts and Pi/install-pi-control-bridge-v2.ps1 for the accepted run-bound worker-control path. The context extension registers the jack-kernel provider from Jack’s live model metadata and defaults to the Jack server root at http://127.0.0.1:8001. The control bridge is installed into Primary Pi, while Jack Orchestrator remains a separate supervisory client and never receives its private token.</w:t>
+        <w:t>The release includes Pi/jack-kernel.ts and Pi/install-jack-kernel-extension.ps1 for provider/context synchronization, plus Pi/pi-control-bridge.ts and Pi/install-pi-control-bridge-v2.ps1 for the current validated run-bound worker-control path. The context extension registers the jack-kernel provider from Jack’s live model metadata and defaults to the Jack server root at http://127.0.0.1:8001. The control bridge is installed into Primary Pi. A local supervisory client remains separate from Primary Pi and never receives the bridge token; other compatible supervisors may use local or cloud cognition according to the canonical Gateway v2 Technical Specification.</w:t>
       </w:r>
     </w:p>
     <w:p>
@@ -11395,7 +11505,7 @@
         <w:pStyle w:val="P22"/>
       </w:pPr>
       <w:r>
-        <w:t>Orchestration replay returns HTTP 409 orchestration_replay_gap: the requested sequence predates the bounded replay buffer. Treat that historical interval as incomplete rather than silently resuming from a guessed position.</w:t>
+        <w:t>Orchestration replay returns HTTP 409 orchestration_replay_gap: the requested sequence predates the bounded replay buffer. Treat that historical interval as incomplete rather than silently resuming from a guessed position. If an SSE reader times out or disconnects without a replay gap, reconnect from the last processed seq; do not treat the reader timeout itself as worker completion or failure.</w:t>
       </w:r>
     </w:p>
     <w:p>
@@ -11403,7 +11513,7 @@
         <w:pStyle w:val="P22"/>
       </w:pPr>
       <w:r>
-        <w:t>Supervisor and worker appear serialized even though the backend has multiple slots: verify Jack launcher Advanced -&gt; Maximum concurrent Kernel requests is saved as 2. A parent-shell environment variable alone can be overwritten by launcher configuration.</w:t>
+        <w:t>Local-model supervisor and worker appear serialized even though the backend has multiple slots: verify Jack launcher Advanced -&gt; Maximum concurrent Kernel requests is saved as 2. A parent-shell environment variable alone can be overwritten by launcher configuration. A cloud-model supervisor does not consume a Jack local-inference slot for its own cognition.</w:t>
       </w:r>
     </w:p>
     <w:p>
@@ -11480,7 +11590,7 @@
         <w:pStyle w:val="P22"/>
       </w:pPr>
       <w:r>
-        <w:t>Pi/pi-control-bridge.ts - accepted run-bound Primary-Pi control bridge for Orchestration Gateway v2.</w:t>
+        <w:t>Documentation/Jack_Kernel_Runtime_Specification_v0.1.1.docx - normative Jack Kernel runtime/conformance specification.</w:t>
       </w:r>
     </w:p>
     <w:p>
@@ -11488,7 +11598,7 @@
         <w:pStyle w:val="P22"/>
       </w:pPr>
       <w:r>
-        <w:t>Pi/install-pi-control-bridge-v2.ps1 - installer/backup helper for the accepted worker-control bridge.</w:t>
+        <w:t>Documentation/Research/Jack_Kernel_Long_Horizon_Cognition_Technical_Whitepaper_v0.1.1.docx - research/architecture paper; not the normative runtime specification.</w:t>
       </w:r>
     </w:p>
     <w:p>
@@ -11496,7 +11606,7 @@
         <w:pStyle w:val="P22"/>
       </w:pPr>
       <w:r>
-        <w:t>ORCHESTRATION_GATEWAY_V2_TECHNICAL_SPEC.md - exact run-bound transport, replay, cancellation, and failure semantics.</w:t>
+        <w:t>Pi/pi-control-bridge.ts - current validated run-bound Primary-Pi control bridge for Orchestration Gateway v2 (SHA-256 E758883F3C18CBEFBF5590C720DBEDF7AB8E85D3314B5EA77E277B1A8C3BD3E4).</w:t>
       </w:r>
     </w:p>
     <w:p>
@@ -11504,7 +11614,31 @@
         <w:pStyle w:val="P22"/>
       </w:pPr>
       <w:r>
-        <w:t>ORCHESTRATION_GATEWAY_V2_ACCEPTANCE_REPORT.md - live acceptance evidence for the completed Gateway v2 boundary tests.</w:t>
+        <w:t>Pi/install-pi-control-bridge-v2.ps1 - installer/backup helper for the current validated worker-control bridge.</w:t>
+      </w:r>
+    </w:p>
+    <w:p>
+      <w:pPr>
+        <w:pStyle w:val="P22"/>
+      </w:pPr>
+      <w:r>
+        <w:t>Documentation/Orchestration/ORCHESTRATION_GATEWAY_V2_TECHNICAL_SPEC.md - canonical orchestration protocol, lifecycle, authority, and supervisor compatibility contract.</w:t>
+      </w:r>
+    </w:p>
+    <w:p>
+      <w:pPr>
+        <w:pStyle w:val="P22"/>
+      </w:pPr>
+      <w:r>
+        <w:t>Documentation/Orchestration/Historical/ORCHESTRATION_GATEWAY_V2_ACCEPTANCE_REPORT_2026-09-12.md - dated historical Gateway v2 acceptance evidence; not current runtime identity authority.</w:t>
+      </w:r>
+    </w:p>
+    <w:p>
+      <w:pPr>
+        <w:pStyle w:val="P22"/>
+      </w:pPr>
+      <w:r>
+        <w:t>Documentation/Orchestration/ORCHESTRATOR_INSTRUCTIONS.md - operational procedure for readiness, task submission, mandatory live SSE supervision, replay/reconnect, silence-not-settlement handling, cancellation, session replacement, and no-bypass failure behavior.</w:t>
       </w:r>
     </w:p>
     <w:p>
@@ -12088,12 +12222,7 @@
         <w:spacing w:lineRule="auto" w:line="259" w:before="0" w:after="100" w:beforeAutospacing="0" w:afterAutospacing="0"/>
       </w:pPr>
       <w:r>
-        <w:rPr>
-          <w:rFonts w:ascii="Aptos" w:hAnsi="Aptos"/>
-          <w:color w:val="28323C"/>
-          <w:sz w:val="21"/>
-        </w:rPr>
-        <w:t>Jack remains research software. Its deterministic guarantees apply to the host-governed surfaces the runtime actually owns. Gateway v2 live acceptance establishes routing, identity, replay, cancellation/settlement, concurrency, and deterministic downstream-failure properties for the supervisor-to-worker transport. It does not prove semantic correctness of model decisions, guarantee that a supervisor will issue good instructions, make replay a durable forensic archive, or prove that every privileged action inside Primary Pi is intercepted by Jack.</w:t>
+        <w:t>Jack remains research software. Its deterministic guarantees apply to the host-governed surfaces the runtime actually owns. Gateway v2 validation establishes routing, identity, replay, cancellation/settlement, concurrency, and deterministic downstream-failure properties for the supervisor-to-worker boundary. The surgical-resilience validation additionally establishes payload-preserving evidence provenance, retry-payload persistence after compatibility adjustment, additive fail-soft runtime-component identity, retry-epoch separation of historical versus current assistant failures, and recoverable tool-failure diagnostics. None of this proves semantic correctness of model decisions, guarantees that a supervisor will issue good instructions, turns replay into a durable forensic archive, or proves universal interception of every privileged action inside Primary Pi.</w:t>
       </w:r>
     </w:p>
     <w:p>
@@ -12228,7 +12357,7 @@
         <w:spacing w:lineRule="auto" w:line="259" w:before="0" w:after="100" w:beforeAutospacing="0" w:afterAutospacing="0"/>
       </w:pPr>
       <w:r>
-        <w:t>The application or agent decides what work to do. The model supplies probabilistic cognition. Jack governs the host-owned inference environment and authority boundaries around that cognition. Deep Research shows custom staged reasoning with X-High Thesis, Medium Antithesis, X-High Synthesis, full active-turn Preserve Thinking, and final Synthesis authority. Agentic uses full native cognition at the highest-value immediate horizon and a second X-High stage to consolidate exact user intent, fresh cognition, tool evidence, and frozen A1 into durable Jack XML attention state. Code Debugging demonstrates fresh-pass, report-only forensic loops with deterministic retention. Orchestration Gateway v2 extends the same host-authoritative principle to a supervisor-to-worker boundary: Jack Orchestrator can reason through Jack and supervise privileged Primary Pi through Jack without receiving filesystem/shell tools, backend topology, or the private bridge credential. Run-bound identity, bounded ordered replay, cancellation versus physical settlement, concurrent supervisor/worker inference, and deterministic Pi-unavailable failure have all been live-accepted. The examples are not the product boundary; Jack is the programmable control layer that makes these code-defined inference and supervisory programs explicit, inspectable, and testable.</w:t>
+        <w:t>The application or agent decides what work to do. The model supplies probabilistic cognition. Jack governs the host-owned inference environment and authority boundaries around that cognition. Deep Research shows custom staged reasoning with X-High Thesis, Medium Antithesis, X-High Synthesis, full active-turn Preserve Thinking, and final Synthesis authority. Agentic uses full native cognition at the highest-value immediate horizon and a second X-High stage to consolidate exact user intent, fresh cognition, tool evidence, and frozen A1 into durable Jack XML attention state. Code Debugging demonstrates fresh-pass, report-only forensic loops with deterministic retention. Orchestration Gateway v2 extends the same doctrine to supervisor-to-worker control: every supervisor controls the worker through Jack; local-model supervisors and Primary Pi reach the local model through Jack; cloud-model supervisors keep native cloud cognition; live SSE/replay provides execution history; deterministic state establishes identity and physical settlement; and model-readable evidence facts remain distinct from host-reserved receipt authority. The reference programs and reference Jack Orchestrator remain examples, not the platform boundary.</w:t>
       </w:r>
     </w:p>
     <w:p>
@@ -13726,12 +13855,7 @@
         <w:spacing w:lineRule="auto" w:line="250" w:after="50" w:beforeAutospacing="0" w:afterAutospacing="0"/>
       </w:pPr>
       <w:r>
-        <w:rPr>
-          <w:rFonts w:ascii="Aptos" w:hAnsi="Aptos"/>
-          <w:color w:val="28323C"/>
-          <w:sz w:val="20"/>
-        </w:rPr>
-        <w:t>Jack Kernel Preview — Programmable Cognition Runtime v0.1.1, updated for the live-accepted Orchestration Gateway v2 integration.</w:t>
+        <w:t>Jack Kernel v0.1.1 Runtime Specification, current normative implementation/conformance authority for inference modes, provenance, retry behavior, runtime identity, and the public control plane.</w:t>
       </w:r>
     </w:p>
     <w:p>
@@ -13740,26 +13864,7 @@
         <w:spacing w:lineRule="auto" w:line="250" w:after="50" w:beforeAutospacing="0" w:afterAutospacing="0"/>
       </w:pPr>
       <w:r>
-        <w:rPr>
-          <w:rFonts w:ascii="Aptos" w:hAnsi="Aptos"/>
-          <w:color w:val="28323C"/>
-          <w:sz w:val="20"/>
-        </w:rPr>
-        <w:t>Jack Kernel v0.1.1 Runtime Specification, updated to include the accepted Gateway v2 runtime/control surface while preserving existing inference-mode contracts.</w:t>
-      </w:r>
-    </w:p>
-    <w:p>
-      <w:pPr>
-        <w:pStyle w:val="P22"/>
-        <w:spacing w:lineRule="auto" w:line="250" w:after="50" w:beforeAutospacing="0" w:afterAutospacing="0"/>
-      </w:pPr>
-      <w:r>
-        <w:rPr>
-          <w:rFonts w:ascii="Aptos" w:hAnsi="Aptos"/>
-          <w:color w:val="28323C"/>
-          <w:sz w:val="20"/>
-        </w:rPr>
-        <w:t>Jack Kernel v0.1.1 Long-Horizon Cognition Technical Whitepaper, updated to incorporate accepted Gateway v2 identity, lifecycle, replay, settlement, concurrency, and boundary semantics.</w:t>
+        <w:t>Jack Kernel v0.1.1 Long-Horizon Cognition Technical Whitepaper, retained as the research/architecture treatment of programmable cognition and long-horizon state rather than as an alternate operating manual.</w:t>
       </w:r>
     </w:p>
     <w:p>
@@ -13793,7 +13898,7 @@
         <w:pStyle w:val="P22"/>
       </w:pPr>
       <w:r>
-        <w:t>Orchestration Gateway v2 Technical Specification, used for run-bound identity, event-envelope, replay, cancellation, settlement, and downstream-failure semantics.</w:t>
+        <w:t>Orchestration Gateway v2 Technical Specification, canonical source for run-bound identity, event envelopes, replay, cancellation, settlement, downstream failure, and cloud/local supervisor compatibility.</w:t>
       </w:r>
     </w:p>
     <w:p>
@@ -13801,7 +13906,15 @@
         <w:pStyle w:val="P22"/>
       </w:pPr>
       <w:r>
-        <w:t>Orchestration Gateway v2 Acceptance Report, used for the live replay, replay-gap, physical-concurrency, cancellation-closure, and Primary-Pi-unavailable evidence summarized in this guide.</w:t>
+        <w:t>Historical Orchestration Gateway v2 Acceptance Report (2026-09-12), preserved as dated evidence of the bridge and boundary tested at that time; not current bridge-identity authority.</w:t>
+      </w:r>
+    </w:p>
+    <w:p>
+      <w:pPr>
+        <w:pStyle w:val="P22"/>
+      </w:pPr>
+      <w:r>
+        <w:t>Orchestrator Instructions, canonical operating procedure for readiness, active SSE supervision, replay/reconnect, silence-not-settlement handling, cognitive cancellation judgment, deterministic cancellation disposal, session replacement, and no-bypass failure behavior.</w:t>
       </w:r>
     </w:p>
     <w:p>

</xml_diff>

<commit_message>
Correct release documentation contracts
</commit_message>
<xml_diff>
--- a/00_Jack_Kernel_Plain_English_Master_Guide_v0.1.1.docx
+++ b/00_Jack_Kernel_Plain_English_Master_Guide_v0.1.1.docx
@@ -3253,7 +3253,7 @@
         <w:pStyle w:val="P22"/>
       </w:pPr>
       <w:r>
-        <w:t>Current validated Primary-Pi bridge identity: SHA-256 E758883F3C18CBEFBF5590C720DBEDF7AB8E85D3314B5EA77E277B1A8C3BD3E4. The September 12 acceptance record preserves the earlier D066... bridge identity as historical evidence rather than rewriting that test history.</w:t>
+        <w:t>Current validated Primary-Pi bridge identity for the Windows CRLF representation: SHA-256 E758883F3C18CBEFBF5590C720DBEDF7AB8E85D3314B5EA77E277B1A8C3BD3E4. Canonical repository LF representation: SHA-256 723338D4F67295AEC5B75886EFEF7843C1A44D01934BF9CBB7C2304B4603F92C. The September 12 acceptance record preserves the earlier D066... bridge identity as historical evidence rather than rewriting that test history.</w:t>
       </w:r>
     </w:p>
     <w:p>
@@ -4849,7 +4849,7 @@
           <w:color w:val="28323C"/>
           <w:sz w:val="20"/>
         </w:rPr>
-        <w:t>There is no A2 and no post-XML answer-generation inference.</w:t>
+        <w:t>There is no A2 and no post-XML answer-generation inference. Once Stage 1 has produced and frozen a trustworthy A1, Jack does not discard that useful work merely because the zero-answer-authority Stage 2 cannot complete: the exact A1 is returned as an explicitly degraded Agentic completion without fabricated Jack XML. Optional forensic persistence is best-effort and does not gate an otherwise complete Jack XML + exact A1 result.</w:t>
       </w:r>
     </w:p>
     <w:p>
@@ -6869,7 +6869,7 @@
           <w:color w:val="28323C"/>
           <w:sz w:val="20"/>
         </w:rPr>
-        <w:t>Agentic may archive completed Stage-1 native reasoning and exact tool chronology before that live cognition is retired.</w:t>
+        <w:t>Agentic may best-effort archive completed Stage-1 native reasoning and exact tool chronology before that live cognition is retired. Archive failure is observational and does not revoke an otherwise complete frozen-A1 + Jack-XML result.</w:t>
       </w:r>
     </w:p>
     <w:p>
@@ -11606,7 +11606,7 @@
         <w:pStyle w:val="P22"/>
       </w:pPr>
       <w:r>
-        <w:t>Pi/pi-control-bridge.ts - current validated run-bound Primary-Pi control bridge for Orchestration Gateway v2 (SHA-256 E758883F3C18CBEFBF5590C720DBEDF7AB8E85D3314B5EA77E277B1A8C3BD3E4).</w:t>
+        <w:t>Pi/pi-control-bridge.ts - current validated run-bound Primary-Pi control bridge for Orchestration Gateway v2 (Windows CRLF SHA-256 E758883F3C18CBEFBF5590C720DBEDF7AB8E85D3314B5EA77E277B1A8C3BD3E4; canonical repository LF SHA-256 723338D4F67295AEC5B75886EFEF7843C1A44D01934BF9CBB7C2304B4603F92C).</w:t>
       </w:r>
     </w:p>
     <w:p>
@@ -12252,7 +12252,7 @@
           <w:color w:val="28323C"/>
           <w:sz w:val="21"/>
         </w:rPr>
-        <w:t>The repository distribution uses the official PolyForm Noncommercial License . The noncommercial license permits qualifying noncommercial use and does not grant commercial or production rights. Commercial or production use — including internal business systems, commercial software offerings, paid API deployments, or other revenue-generating activity — requires a separate written commercial license from the licensor.</w:t>
+        <w:t>The repository distribution uses the official PolyForm Noncommercial License 1.0.0. The license permits qualifying noncommercial use under its terms. Commercial use requires a separate written commercial license from the licensor.</w:t>
       </w:r>
     </w:p>
     <w:p>

</xml_diff>

<commit_message>
Preserve governing documentation and add multi-endpoint architecture
</commit_message>
<xml_diff>
--- a/00_Jack_Kernel_Plain_English_Master_Guide_v0.1.1.docx
+++ b/00_Jack_Kernel_Plain_English_Master_Guide_v0.1.1.docx
@@ -3272,6 +3272,124 @@
       </w:pPr>
       <w:r>
         <w:t>Gateway v2 does not make an orchestration agent a privileged execution agent, does not make model cognition deterministic, does not turn the bounded replay buffer into a durable forensic archive, and does not claim universal interception of every action available inside Primary Pi. The precise claim is narrower and stronger: Jack mediates the supervisor-to-worker control boundary; for locally modeled participants it also mediates local-model inference; deterministic transport state remains separate from the supervisor model’s interpretation of that state.</w:t>
+      </w:r>
+    </w:p>
+    <w:p>
+      <w:r>
+        <w:t>Be strict about truth, identity, authority, and irreversible consequences; be resilient about useful work.</w:t>
+      </w:r>
+    </w:p>
+    <w:p>
+      <w:r>
+        <w:t>CURRENT ARCHITECTURE UPDATE — 23 SEPTEMBER 2026</w:t>
+      </w:r>
+    </w:p>
+    <w:p>
+      <w:r>
+        <w:t>Jack Kernel remains v0.1.1. Multi-endpoint runtime lanes are merged into main through PR #15 (7cf530d33c28f62c8ee057c1dd236173124d95d7); non-authoritative runtime activity observability is merged through PR #16/current main (f8be952d704c8d429cffac6dafe05338fe86a8e6). These changes extend runtime topology, identity, discovery, worker binding, and observability. They do not replace or narrow the existing Deep Research, Agentic, Code Debugging, Preserve-Thinking, Jack XML, tool-authority, freeze/commit, evidence, or durability contracts already documented below.</w:t>
+      </w:r>
+    </w:p>
+    <w:p>
+      <w:pPr>
+        <w:pStyle w:val="P3"/>
+      </w:pPr>
+      <w:r>
+        <w:t>Multi-endpoint runtime lanes: several nervous-system lanes, one deterministic ownership model</w:t>
+      </w:r>
+    </w:p>
+    <w:p>
+      <w:r>
+        <w:t>Jack can keep several independently identifiable runtime lanes active at once. A runtime lane is a separate Jack OS process with its own logical runtime identity, lane identity, cognition mode, state, and authority context. The first multi-endpoint release deliberately uses OS-process separation rather than claiming arbitrary safe in-process multiplexing.</w:t>
+      </w:r>
+    </w:p>
+    <w:p>
+      <w:r>
+        <w:t>Identity is not the port</w:t>
+      </w:r>
+    </w:p>
+    <w:p>
+      <w:r>
+        <w:t>A port, socket, or URL answers where a process can currently be reached; it does not answer who owns the work. Logical ownership is carried by runtime_id, lane_id, mode, session/task/run identity where applicable, run epoch, and the relevant credential/security context. Endpoint movement does not create a new runtime identity.</w:t>
+      </w:r>
+    </w:p>
+    <w:p>
+      <w:r>
+        <w:t>Preferred endpoint and atomic fallback</w:t>
+      </w:r>
+    </w:p>
+    <w:p>
+      <w:r>
+        <w:t>Each lane first attempts its preferred loopback endpoint. If binding fails with recoverable EADDRINUSE and fallback is enabled, Jack keeps an already-bound OS-assigned loopback socket and publishes that actual endpoint. It does not scan for a free port and later race to bind it. If fallback is disabled, the occupied preferred endpoint remains a deliberate hard failure.</w:t>
+      </w:r>
+    </w:p>
+    <w:p>
+      <w:r>
+        <w:t>Registry discovery and live identity</w:t>
+      </w:r>
+    </w:p>
+    <w:p>
+      <w:r>
+        <w:t>Runtime manifests support discovery, but registry/manifest state is observational evidence rather than final runtime authority. A stale manifest status must not veto a runtime whose expected runtime_id has been positively verified against live /health. Duplicate live runtime_id ownership is rejected. Stale identity can be reclaimed only after OS-appropriate liveness checking establishes that the previous owner is gone.</w:t>
+      </w:r>
+    </w:p>
+    <w:p>
+      <w:r>
+        <w:t>Privileged worker binding has two sides</w:t>
+      </w:r>
+    </w:p>
+    <w:p>
+      <w:r>
+        <w:t>The current validated Primary-Pi bridge identities remain Windows CRLF SHA-256 93A6843CDAAEDA637474B584919ED003930296DE281570E3DDC391F54EF65565 and canonical repository LF SHA-256 8FFD33FD33AE15A785E2BF9015F17FC14F1DE27B09515D5E868EC163D54C15F0. For a named effect-capable lane, Jack binds to the named Pi worker/bridge identity plus an explicit credential. Separately, that worker's Pi provider binds back to the owning Jack runtime_id, resolves its current endpoint from the runtime registry, verifies live /health.runtime_id, and only then registers. Port fallback on either side changes transport location without changing logical ownership. Multiple lanes do not implicitly share one privileged worker context in this release.</w:t>
+      </w:r>
+    </w:p>
+    <w:p>
+      <w:r>
+        <w:t>Runtime activity is observability, not authority</w:t>
+      </w:r>
+    </w:p>
+    <w:p>
+      <w:r>
+        <w:t>Authenticated GET /jack/runtime/status reports process-local activity such as idle/busy state, queued/running counts, stage identity, backend-request activity, elapsed time, last-request state, and runtime/lane identity. This telemetry is out-of-band: it is not model context, stage authority, answer authority, commit authority, or cancellation authority. If telemetry becomes unreliable, Jack reports degraded/unknown rather than manufacturing idle or another known state.</w:t>
+      </w:r>
+    </w:p>
+    <w:p>
+      <w:r>
+        <w:t>A disconnected client does not cancel cognition</w:t>
+      </w:r>
+    </w:p>
+    <w:p>
+      <w:r>
+        <w:t>Loss of an HTTP client is a transport fact, not cognition-cancellation authority. Otherwise valid cognition continues through its normal freeze, commit, and settlement path unless a separate authorized cancellation or a hard deterministic identity, credential, security, run-ownership, irreversible-effect, or integrity condition requires termination.</w:t>
+      </w:r>
+    </w:p>
+    <w:p>
+      <w:r>
+        <w:t>Strict authority, resilient execution</w:t>
+      </w:r>
+    </w:p>
+    <w:p>
+      <w:r>
+        <w:t>Jack remains strict about truth, identity, credentials, run/epoch ownership, hard DLP/security violations, unauthorized irreversible effects, and unrecoverable integrity failures. Recoverable endpoint collision, endpoint movement, stale observational status, telemetry failure, and client transport disconnect do not automatically acquire authority to destroy useful work.</w:t>
+      </w:r>
+    </w:p>
+    <w:p>
+      <w:r>
+        <w:t>Concurrency boundary and non-goals</w:t>
+      </w:r>
+    </w:p>
+    <w:p>
+      <w:r>
+        <w:t>JACK_MAX_CONCURRENT remains process-local. Multiple lanes may coexist against shared model infrastructure, but lane availability is not proof of fleet-wide backend admission and does not by itself prove physically simultaneous GPU generation. The accepted upgrade does not add a global scheduler, automatic lane/mode selector, cross-process GPU scheduler, detached-job framework, automatic workload balancer, shared multi-tenant privileged worker, or arbitrary in-process lane multiplexer.</w:t>
+      </w:r>
+    </w:p>
+    <w:p>
+      <w:r>
+        <w:t>Acceptance scope</w:t>
+      </w:r>
+    </w:p>
+    <w:p>
+      <w:r>
+        <w:t>Qualification covered multiple live Jack runtimes, preferred-port fallback and fallback-disabled failure, lane isolation, stale identity reclaim, duplicate live identity rejection, independent Agentic and Deep Research histories, named Pi worker isolation, wrong-token and wrong-bridge rejection, worker fallback rediscovery, provider binding to the owning Jack runtime, and full Agentic/Deep Research end-to-end execution. This validates the changed topology and authority boundaries; it does not claim unlimited physical backend concurrency or alter the cognition contracts already documented.</w:t>
       </w:r>
     </w:p>
     <w:p>

</xml_diff>

<commit_message>
Fix governing document numbering and bridge provenance
</commit_message>
<xml_diff>
--- a/00_Jack_Kernel_Plain_English_Master_Guide_v0.1.1.docx
+++ b/00_Jack_Kernel_Plain_English_Master_Guide_v0.1.1.docx
@@ -3253,7 +3253,7 @@
         <w:pStyle w:val="P22"/>
       </w:pPr>
       <w:r>
-        <w:t>Current validated Primary-Pi bridge identity for the Windows CRLF representation: SHA-256 E758883F3C18CBEFBF5590C720DBEDF7AB8E85D3314B5EA77E277B1A8C3BD3E4. Canonical repository LF representation: SHA-256 723338D4F67295AEC5B75886EFEF7843C1A44D01934BF9CBB7C2304B4603F92C. The September 12 acceptance record preserves the earlier D066... bridge identity as historical evidence rather than rewriting that test history.</w:t>
+        <w:t>Prior validated Gateway v2 Primary-Pi bridge identity at that revision for the Windows CRLF representation: SHA-256 E758883F3C18CBEFBF5590C720DBEDF7AB8E85D3314B5EA77E277B1A8C3BD3E4. Canonical repository LF representation at that revision: SHA-256 723338D4F67295AEC5B75886EFEF7843C1A44D01934BF9CBB7C2304B4603F92C. The September 12 acceptance record preserves the earlier D066... bridge identity as historical evidence rather than rewriting that test history.</w:t>
       </w:r>
     </w:p>
     <w:p>
@@ -3286,7 +3286,7 @@
     </w:p>
     <w:p>
       <w:r>
-        <w:t>Jack Kernel remains v0.1.1. Multi-endpoint runtime lanes are merged into main through PR #15 (7cf530d33c28f62c8ee057c1dd236173124d95d7); non-authoritative runtime activity observability is merged through PR #16/current main (f8be952d704c8d429cffac6dafe05338fe86a8e6). These changes extend runtime topology, identity, discovery, worker binding, and observability. They do not replace or narrow the existing Deep Research, Agentic, Code Debugging, Preserve-Thinking, Jack XML, tool-authority, freeze/commit, evidence, or durability contracts already documented below.</w:t>
+        <w:t>Jack Kernel remains v0.1.1. PR #15 merged the multi-endpoint runtime-lane substrate at 7cf530d33c28f62c8ee057c1dd236173124d95d7; PR #16 merged the runtime-observability baseline at f8be952d704c8d429cffac6dafe05338fe86a8e6. These changes extend runtime topology, identity, discovery, worker binding, and observability. They do not replace or narrow the existing Deep Research, Agentic, Code Debugging, Preserve-Thinking, Jack XML, tool-authority, freeze/commit, evidence, or durability contracts already documented below.</w:t>
       </w:r>
     </w:p>
     <w:p>
@@ -3303,6 +3303,9 @@
       </w:r>
     </w:p>
     <w:p>
+      <w:pPr>
+        <w:pStyle w:val="P4"/>
+      </w:pPr>
       <w:r>
         <w:t>Identity is not the port</w:t>
       </w:r>
@@ -3313,6 +3316,9 @@
       </w:r>
     </w:p>
     <w:p>
+      <w:pPr>
+        <w:pStyle w:val="P4"/>
+      </w:pPr>
       <w:r>
         <w:t>Preferred endpoint and atomic fallback</w:t>
       </w:r>
@@ -3323,6 +3329,9 @@
       </w:r>
     </w:p>
     <w:p>
+      <w:pPr>
+        <w:pStyle w:val="P4"/>
+      </w:pPr>
       <w:r>
         <w:t>Registry discovery and live identity</w:t>
       </w:r>
@@ -3333,6 +3342,9 @@
       </w:r>
     </w:p>
     <w:p>
+      <w:pPr>
+        <w:pStyle w:val="P4"/>
+      </w:pPr>
       <w:r>
         <w:t>Privileged worker binding has two sides</w:t>
       </w:r>
@@ -3343,6 +3355,9 @@
       </w:r>
     </w:p>
     <w:p>
+      <w:pPr>
+        <w:pStyle w:val="P4"/>
+      </w:pPr>
       <w:r>
         <w:t>Runtime activity is observability, not authority</w:t>
       </w:r>
@@ -3353,6 +3368,9 @@
       </w:r>
     </w:p>
     <w:p>
+      <w:pPr>
+        <w:pStyle w:val="P4"/>
+      </w:pPr>
       <w:r>
         <w:t>A disconnected client does not cancel cognition</w:t>
       </w:r>
@@ -3363,6 +3381,9 @@
       </w:r>
     </w:p>
     <w:p>
+      <w:pPr>
+        <w:pStyle w:val="P4"/>
+      </w:pPr>
       <w:r>
         <w:t>Strict authority, resilient execution</w:t>
       </w:r>
@@ -3373,6 +3394,9 @@
       </w:r>
     </w:p>
     <w:p>
+      <w:pPr>
+        <w:pStyle w:val="P4"/>
+      </w:pPr>
       <w:r>
         <w:t>Concurrency boundary and non-goals</w:t>
       </w:r>
@@ -3383,6 +3407,9 @@
       </w:r>
     </w:p>
     <w:p>
+      <w:pPr>
+        <w:pStyle w:val="P4"/>
+      </w:pPr>
       <w:r>
         <w:t>Acceptance scope</w:t>
       </w:r>
@@ -11724,7 +11751,7 @@
         <w:pStyle w:val="P22"/>
       </w:pPr>
       <w:r>
-        <w:t>Pi/pi-control-bridge.ts - current validated run-bound Primary-Pi control bridge for Orchestration Gateway v2 (Windows CRLF SHA-256 E758883F3C18CBEFBF5590C720DBEDF7AB8E85D3314B5EA77E277B1A8C3BD3E4; canonical repository LF SHA-256 723338D4F67295AEC5B75886EFEF7843C1A44D01934BF9CBB7C2304B4603F92C).</w:t>
+        <w:t>Pi/pi-control-bridge.ts - prior validated run-bound Primary-Pi control bridge identity for Orchestration Gateway v2 at that revision (Windows CRLF SHA-256 E758883F3C18CBEFBF5590C720DBEDF7AB8E85D3314B5EA77E277B1A8C3BD3E4; canonical repository LF SHA-256 723338D4F67295AEC5B75886EFEF7843C1A44D01934BF9CBB7C2304B4603F92C).</w:t>
       </w:r>
     </w:p>
     <w:p>

</xml_diff>